<commit_message>
docs(ebac): enlaza el pull request en el mensaje y el documento
</commit_message>
<xml_diff>
--- a/docs/EBAC_M13_Django_Views.docx
+++ b/docs/EBAC_M13_Django_Views.docx
@@ -42,7 +42,7 @@
         </w:rPr>
         <w:t xml:space="preserve">Repositorio (rama practicas-ebac): </w:t>
       </w:r>
-      <w:hyperlink w:history="1" r:id="rIdxynk32kegml0qpckentsq">
+      <w:hyperlink w:history="1" r:id="rIdlfg6zbjh930he7g9okmuk">
         <w:r>
           <w:rPr>
             <w:rStyle w:val="Hyperlink"/>
@@ -50,6 +50,28 @@
             <w:szCs w:val="22"/>
           </w:rPr>
           <w:t xml:space="preserve">https://github.com/pipeTawns-x/Landingpages-Carni.pwa/tree/practicas-ebac</w:t>
+        </w:r>
+      </w:hyperlink>
+    </w:p>
+    <w:p>
+      <w:pPr>
+        <w:spacing w:after="100"/>
+      </w:pPr>
+      <w:r>
+        <w:rPr>
+          <w:sz w:val="22"/>
+          <w:szCs w:val="22"/>
+        </w:rPr>
+        <w:t xml:space="preserve">Pull request de la entrega: </w:t>
+      </w:r>
+      <w:hyperlink w:history="1" r:id="rIdaduun3ledmijx43dgmhhj">
+        <w:r>
+          <w:rPr>
+            <w:rStyle w:val="Hyperlink"/>
+            <w:sz w:val="22"/>
+            <w:szCs w:val="22"/>
+          </w:rPr>
+          <w:t xml:space="preserve">https://github.com/pipeTawns-x/Landingpages-Carni.pwa/pull/10</w:t>
         </w:r>
       </w:hyperlink>
     </w:p>

</xml_diff>